<commit_message>
termino produtos; adição contatos 11/09
</commit_message>
<xml_diff>
--- a/apostila/Projeto Space For Men.docx
+++ b/apostila/Projeto Space For Men.docx
@@ -5053,6 +5053,9 @@
         <w:jc w:val="center"/>
       </w:pPr>
       <w:r>
+        <w:rPr>
+          <w:noProof/>
+        </w:rPr>
         <w:drawing>
           <wp:inline distT="0" distB="0" distL="0" distR="0" wp14:anchorId="1F4AFB5A" wp14:editId="1A996C96">
             <wp:extent cx="2010056" cy="1105054"/>
@@ -5118,6 +5121,9 @@
         <w:jc w:val="center"/>
       </w:pPr>
       <w:r>
+        <w:rPr>
+          <w:noProof/>
+        </w:rPr>
         <w:lastRenderedPageBreak/>
         <w:drawing>
           <wp:inline distT="0" distB="0" distL="0" distR="0" wp14:anchorId="1ED2E5FF" wp14:editId="6ED27763">
@@ -5192,6 +5198,9 @@
         <w:jc w:val="center"/>
       </w:pPr>
       <w:r>
+        <w:rPr>
+          <w:noProof/>
+        </w:rPr>
         <w:drawing>
           <wp:inline distT="0" distB="0" distL="0" distR="0" wp14:anchorId="48F3896E" wp14:editId="41EC27EA">
             <wp:extent cx="2896004" cy="1800476"/>
@@ -5252,6 +5261,9 @@
         <w:pStyle w:val="PargrafodaLista"/>
       </w:pPr>
       <w:r>
+        <w:rPr>
+          <w:noProof/>
+        </w:rPr>
         <w:lastRenderedPageBreak/>
         <w:drawing>
           <wp:inline distT="0" distB="0" distL="0" distR="0" wp14:anchorId="758C6E87" wp14:editId="0ECDACAD">
@@ -5322,6 +5334,9 @@
         <w:jc w:val="center"/>
       </w:pPr>
       <w:r>
+        <w:rPr>
+          <w:noProof/>
+        </w:rPr>
         <w:drawing>
           <wp:inline distT="0" distB="0" distL="0" distR="0" wp14:anchorId="59CF8C9A" wp14:editId="0A51D28E">
             <wp:extent cx="2810267" cy="1895740"/>
@@ -5386,6 +5401,9 @@
         <w:pStyle w:val="PargrafodaLista"/>
       </w:pPr>
       <w:r>
+        <w:rPr>
+          <w:noProof/>
+        </w:rPr>
         <w:drawing>
           <wp:inline distT="0" distB="0" distL="0" distR="0" wp14:anchorId="24F99C4E" wp14:editId="5E05FF58">
             <wp:extent cx="5400040" cy="2332355"/>
@@ -5461,6 +5479,9 @@
         <w:jc w:val="center"/>
       </w:pPr>
       <w:r>
+        <w:rPr>
+          <w:noProof/>
+        </w:rPr>
         <w:drawing>
           <wp:inline distT="0" distB="0" distL="0" distR="0" wp14:anchorId="43133CC5" wp14:editId="540F36CB">
             <wp:extent cx="2133898" cy="1047896"/>
@@ -5526,6 +5547,9 @@
         <w:jc w:val="center"/>
       </w:pPr>
       <w:r>
+        <w:rPr>
+          <w:noProof/>
+        </w:rPr>
         <w:drawing>
           <wp:inline distT="0" distB="0" distL="0" distR="0" wp14:anchorId="15F074DC" wp14:editId="3AE2576F">
             <wp:extent cx="5400040" cy="2428875"/>
@@ -5603,6 +5627,9 @@
         <w:jc w:val="center"/>
       </w:pPr>
       <w:r>
+        <w:rPr>
+          <w:noProof/>
+        </w:rPr>
         <w:drawing>
           <wp:inline distT="0" distB="0" distL="0" distR="0" wp14:anchorId="24F9C6B1" wp14:editId="1D482E13">
             <wp:extent cx="2781688" cy="2057687"/>
@@ -5668,6 +5695,9 @@
         <w:jc w:val="center"/>
       </w:pPr>
       <w:r>
+        <w:rPr>
+          <w:noProof/>
+        </w:rPr>
         <w:lastRenderedPageBreak/>
         <w:drawing>
           <wp:inline distT="0" distB="0" distL="0" distR="0" wp14:anchorId="47B1D72F" wp14:editId="6E8CF20B">
@@ -5745,6 +5775,9 @@
         <w:jc w:val="center"/>
       </w:pPr>
       <w:r>
+        <w:rPr>
+          <w:noProof/>
+        </w:rPr>
         <w:drawing>
           <wp:inline distT="0" distB="0" distL="0" distR="0" wp14:anchorId="2992E794" wp14:editId="03CAE366">
             <wp:extent cx="2829320" cy="847843"/>
@@ -5810,6 +5843,9 @@
         <w:jc w:val="center"/>
       </w:pPr>
       <w:r>
+        <w:rPr>
+          <w:noProof/>
+        </w:rPr>
         <w:drawing>
           <wp:inline distT="0" distB="0" distL="0" distR="0" wp14:anchorId="289905DA" wp14:editId="692E588F">
             <wp:extent cx="2876951" cy="724001"/>
@@ -5875,6 +5911,9 @@
         <w:jc w:val="center"/>
       </w:pPr>
       <w:r>
+        <w:rPr>
+          <w:noProof/>
+        </w:rPr>
         <w:drawing>
           <wp:inline distT="0" distB="0" distL="0" distR="0" wp14:anchorId="71B942B3" wp14:editId="6B40D2D9">
             <wp:extent cx="2676899" cy="676369"/>
@@ -5940,6 +5979,9 @@
         <w:jc w:val="center"/>
       </w:pPr>
       <w:r>
+        <w:rPr>
+          <w:noProof/>
+        </w:rPr>
         <w:lastRenderedPageBreak/>
         <w:drawing>
           <wp:inline distT="0" distB="0" distL="0" distR="0" wp14:anchorId="7BACA2EE" wp14:editId="6C2E9ED8">
@@ -5995,10 +6037,1307 @@
         <w:t>A</w:t>
       </w:r>
       <w:r>
-        <w:t xml:space="preserve"> </w:t>
+        <w:t>dição de cor da borda ao pressionar a imagem:</w:t>
+      </w:r>
+    </w:p>
+    <w:p>
+      <w:pPr>
+        <w:pStyle w:val="PargrafodaLista"/>
+      </w:pPr>
+    </w:p>
+    <w:p>
+      <w:pPr>
+        <w:pStyle w:val="PargrafodaLista"/>
+        <w:numPr>
+          <w:ilvl w:val="0"/>
+          <w:numId w:val="3"/>
+        </w:numPr>
+      </w:pPr>
+      <w:proofErr w:type="spellStart"/>
+      <w:r>
+        <w:t>Css</w:t>
+      </w:r>
+      <w:proofErr w:type="spellEnd"/>
+      <w:r>
+        <w:t>:</w:t>
+      </w:r>
+    </w:p>
+    <w:p>
+      <w:pPr>
+        <w:pStyle w:val="PargrafodaLista"/>
+      </w:pPr>
+    </w:p>
+    <w:p>
+      <w:pPr>
+        <w:pStyle w:val="PargrafodaLista"/>
+        <w:jc w:val="center"/>
+      </w:pPr>
+      <w:r>
+        <w:drawing>
+          <wp:inline distT="0" distB="0" distL="0" distR="0" wp14:anchorId="5D1D91DC" wp14:editId="52717E16">
+            <wp:extent cx="2619741" cy="600159"/>
+            <wp:effectExtent l="0" t="0" r="0" b="9525"/>
+            <wp:docPr id="79" name="Imagem 79"/>
+            <wp:cNvGraphicFramePr>
+              <a:graphicFrameLocks xmlns:a="http://schemas.openxmlformats.org/drawingml/2006/main" noChangeAspect="1"/>
+            </wp:cNvGraphicFramePr>
+            <a:graphic xmlns:a="http://schemas.openxmlformats.org/drawingml/2006/main">
+              <a:graphicData uri="http://schemas.openxmlformats.org/drawingml/2006/picture">
+                <pic:pic xmlns:pic="http://schemas.openxmlformats.org/drawingml/2006/picture">
+                  <pic:nvPicPr>
+                    <pic:cNvPr id="1" name=""/>
+                    <pic:cNvPicPr/>
+                  </pic:nvPicPr>
+                  <pic:blipFill>
+                    <a:blip r:embed="rId85"/>
+                    <a:stretch>
+                      <a:fillRect/>
+                    </a:stretch>
+                  </pic:blipFill>
+                  <pic:spPr>
+                    <a:xfrm>
+                      <a:off x="0" y="0"/>
+                      <a:ext cx="2619741" cy="600159"/>
+                    </a:xfrm>
+                    <a:prstGeom prst="rect">
+                      <a:avLst/>
+                    </a:prstGeom>
+                  </pic:spPr>
+                </pic:pic>
+              </a:graphicData>
+            </a:graphic>
+          </wp:inline>
+        </w:drawing>
+      </w:r>
+    </w:p>
+    <w:p>
+      <w:pPr>
+        <w:pStyle w:val="PargrafodaLista"/>
+      </w:pPr>
+    </w:p>
+    <w:p>
+      <w:pPr>
+        <w:pStyle w:val="PargrafodaLista"/>
+        <w:numPr>
+          <w:ilvl w:val="0"/>
+          <w:numId w:val="3"/>
+        </w:numPr>
+      </w:pPr>
+      <w:r>
+        <w:t>Site:</w:t>
+      </w:r>
+    </w:p>
+    <w:p>
+      <w:pPr>
+        <w:pStyle w:val="PargrafodaLista"/>
+      </w:pPr>
+    </w:p>
+    <w:p>
+      <w:pPr>
+        <w:pStyle w:val="PargrafodaLista"/>
+        <w:jc w:val="center"/>
+      </w:pPr>
+      <w:r>
+        <w:drawing>
+          <wp:inline distT="0" distB="0" distL="0" distR="0" wp14:anchorId="5B80C005" wp14:editId="00397B1D">
+            <wp:extent cx="5400040" cy="2439035"/>
+            <wp:effectExtent l="0" t="0" r="0" b="0"/>
+            <wp:docPr id="69" name="Imagem 69"/>
+            <wp:cNvGraphicFramePr>
+              <a:graphicFrameLocks xmlns:a="http://schemas.openxmlformats.org/drawingml/2006/main" noChangeAspect="1"/>
+            </wp:cNvGraphicFramePr>
+            <a:graphic xmlns:a="http://schemas.openxmlformats.org/drawingml/2006/main">
+              <a:graphicData uri="http://schemas.openxmlformats.org/drawingml/2006/picture">
+                <pic:pic xmlns:pic="http://schemas.openxmlformats.org/drawingml/2006/picture">
+                  <pic:nvPicPr>
+                    <pic:cNvPr id="1" name=""/>
+                    <pic:cNvPicPr/>
+                  </pic:nvPicPr>
+                  <pic:blipFill>
+                    <a:blip r:embed="rId86"/>
+                    <a:stretch>
+                      <a:fillRect/>
+                    </a:stretch>
+                  </pic:blipFill>
+                  <pic:spPr>
+                    <a:xfrm>
+                      <a:off x="0" y="0"/>
+                      <a:ext cx="5400040" cy="2439035"/>
+                    </a:xfrm>
+                    <a:prstGeom prst="rect">
+                      <a:avLst/>
+                    </a:prstGeom>
+                  </pic:spPr>
+                </pic:pic>
+              </a:graphicData>
+            </a:graphic>
+          </wp:inline>
+        </w:drawing>
+      </w:r>
+    </w:p>
+    <w:p>
+      <w:pPr>
+        <w:pStyle w:val="PargrafodaLista"/>
+      </w:pPr>
+    </w:p>
+    <w:p>
+      <w:pPr>
+        <w:pStyle w:val="PargrafodaLista"/>
+        <w:numPr>
+          <w:ilvl w:val="0"/>
+          <w:numId w:val="4"/>
+        </w:numPr>
+      </w:pPr>
+      <w:r>
+        <w:t xml:space="preserve">Adição de decoração, fazer </w:t>
+      </w:r>
+      <w:proofErr w:type="gramStart"/>
+      <w:r>
+        <w:t>as box</w:t>
+      </w:r>
+      <w:proofErr w:type="gramEnd"/>
+      <w:r>
+        <w:t xml:space="preserve"> de produtos aumentarem quando passar o mouse em cima:</w:t>
+      </w:r>
+    </w:p>
+    <w:p>
+      <w:pPr>
+        <w:pStyle w:val="PargrafodaLista"/>
+      </w:pPr>
+    </w:p>
+    <w:p>
+      <w:pPr>
+        <w:pStyle w:val="PargrafodaLista"/>
+        <w:numPr>
+          <w:ilvl w:val="0"/>
+          <w:numId w:val="3"/>
+        </w:numPr>
+      </w:pPr>
+      <w:proofErr w:type="spellStart"/>
+      <w:r>
+        <w:t>Css</w:t>
+      </w:r>
+      <w:proofErr w:type="spellEnd"/>
+      <w:r>
+        <w:t>:</w:t>
+      </w:r>
+    </w:p>
+    <w:p>
+      <w:pPr>
+        <w:pStyle w:val="PargrafodaLista"/>
+      </w:pPr>
+    </w:p>
+    <w:p>
+      <w:pPr>
+        <w:pStyle w:val="PargrafodaLista"/>
+        <w:jc w:val="center"/>
+      </w:pPr>
+      <w:r>
+        <w:drawing>
+          <wp:inline distT="0" distB="0" distL="0" distR="0" wp14:anchorId="7670FD5F" wp14:editId="67B51574">
+            <wp:extent cx="2257740" cy="647790"/>
+            <wp:effectExtent l="0" t="0" r="9525" b="0"/>
+            <wp:docPr id="74" name="Imagem 74"/>
+            <wp:cNvGraphicFramePr>
+              <a:graphicFrameLocks xmlns:a="http://schemas.openxmlformats.org/drawingml/2006/main" noChangeAspect="1"/>
+            </wp:cNvGraphicFramePr>
+            <a:graphic xmlns:a="http://schemas.openxmlformats.org/drawingml/2006/main">
+              <a:graphicData uri="http://schemas.openxmlformats.org/drawingml/2006/picture">
+                <pic:pic xmlns:pic="http://schemas.openxmlformats.org/drawingml/2006/picture">
+                  <pic:nvPicPr>
+                    <pic:cNvPr id="1" name=""/>
+                    <pic:cNvPicPr/>
+                  </pic:nvPicPr>
+                  <pic:blipFill>
+                    <a:blip r:embed="rId87"/>
+                    <a:stretch>
+                      <a:fillRect/>
+                    </a:stretch>
+                  </pic:blipFill>
+                  <pic:spPr>
+                    <a:xfrm>
+                      <a:off x="0" y="0"/>
+                      <a:ext cx="2257740" cy="647790"/>
+                    </a:xfrm>
+                    <a:prstGeom prst="rect">
+                      <a:avLst/>
+                    </a:prstGeom>
+                  </pic:spPr>
+                </pic:pic>
+              </a:graphicData>
+            </a:graphic>
+          </wp:inline>
+        </w:drawing>
+      </w:r>
+    </w:p>
+    <w:p>
+      <w:pPr>
+        <w:pStyle w:val="PargrafodaLista"/>
+      </w:pPr>
+    </w:p>
+    <w:p>
+      <w:pPr>
+        <w:pStyle w:val="PargrafodaLista"/>
+        <w:numPr>
+          <w:ilvl w:val="0"/>
+          <w:numId w:val="3"/>
+        </w:numPr>
+      </w:pPr>
+      <w:r>
+        <w:t>Site:</w:t>
+      </w:r>
+    </w:p>
+    <w:p>
+      <w:pPr>
+        <w:pStyle w:val="PargrafodaLista"/>
+      </w:pPr>
+    </w:p>
+    <w:p>
+      <w:pPr>
+        <w:pStyle w:val="PargrafodaLista"/>
+        <w:jc w:val="center"/>
+      </w:pPr>
+      <w:r>
+        <w:drawing>
+          <wp:inline distT="0" distB="0" distL="0" distR="0" wp14:anchorId="535D4C93" wp14:editId="66E8AFA7">
+            <wp:extent cx="5400040" cy="2542540"/>
+            <wp:effectExtent l="0" t="0" r="0" b="0"/>
+            <wp:docPr id="70" name="Imagem 70"/>
+            <wp:cNvGraphicFramePr>
+              <a:graphicFrameLocks xmlns:a="http://schemas.openxmlformats.org/drawingml/2006/main" noChangeAspect="1"/>
+            </wp:cNvGraphicFramePr>
+            <a:graphic xmlns:a="http://schemas.openxmlformats.org/drawingml/2006/main">
+              <a:graphicData uri="http://schemas.openxmlformats.org/drawingml/2006/picture">
+                <pic:pic xmlns:pic="http://schemas.openxmlformats.org/drawingml/2006/picture">
+                  <pic:nvPicPr>
+                    <pic:cNvPr id="1" name=""/>
+                    <pic:cNvPicPr/>
+                  </pic:nvPicPr>
+                  <pic:blipFill>
+                    <a:blip r:embed="rId88"/>
+                    <a:stretch>
+                      <a:fillRect/>
+                    </a:stretch>
+                  </pic:blipFill>
+                  <pic:spPr>
+                    <a:xfrm>
+                      <a:off x="0" y="0"/>
+                      <a:ext cx="5400040" cy="2542540"/>
+                    </a:xfrm>
+                    <a:prstGeom prst="rect">
+                      <a:avLst/>
+                    </a:prstGeom>
+                  </pic:spPr>
+                </pic:pic>
+              </a:graphicData>
+            </a:graphic>
+          </wp:inline>
+        </w:drawing>
+      </w:r>
+    </w:p>
+    <w:p>
+      <w:pPr>
+        <w:pStyle w:val="PargrafodaLista"/>
+        <w:numPr>
+          <w:ilvl w:val="0"/>
+          <w:numId w:val="4"/>
+        </w:numPr>
+      </w:pPr>
+      <w:r>
+        <w:t xml:space="preserve">Adição de imagem e paragrafo ao </w:t>
+      </w:r>
+      <w:proofErr w:type="spellStart"/>
+      <w:r>
+        <w:t>footer</w:t>
+      </w:r>
+      <w:proofErr w:type="spellEnd"/>
+      <w:r>
+        <w:t>:</w:t>
+      </w:r>
+    </w:p>
+    <w:p>
+      <w:pPr>
+        <w:pStyle w:val="PargrafodaLista"/>
+      </w:pPr>
+    </w:p>
+    <w:p>
+      <w:pPr>
+        <w:pStyle w:val="PargrafodaLista"/>
+        <w:jc w:val="center"/>
+      </w:pPr>
+      <w:r>
+        <w:drawing>
+          <wp:inline distT="0" distB="0" distL="0" distR="0" wp14:anchorId="285D7D55" wp14:editId="259DE3FF">
+            <wp:extent cx="4686954" cy="857370"/>
+            <wp:effectExtent l="0" t="0" r="0" b="0"/>
+            <wp:docPr id="73" name="Imagem 73"/>
+            <wp:cNvGraphicFramePr>
+              <a:graphicFrameLocks xmlns:a="http://schemas.openxmlformats.org/drawingml/2006/main" noChangeAspect="1"/>
+            </wp:cNvGraphicFramePr>
+            <a:graphic xmlns:a="http://schemas.openxmlformats.org/drawingml/2006/main">
+              <a:graphicData uri="http://schemas.openxmlformats.org/drawingml/2006/picture">
+                <pic:pic xmlns:pic="http://schemas.openxmlformats.org/drawingml/2006/picture">
+                  <pic:nvPicPr>
+                    <pic:cNvPr id="1" name=""/>
+                    <pic:cNvPicPr/>
+                  </pic:nvPicPr>
+                  <pic:blipFill>
+                    <a:blip r:embed="rId89"/>
+                    <a:stretch>
+                      <a:fillRect/>
+                    </a:stretch>
+                  </pic:blipFill>
+                  <pic:spPr>
+                    <a:xfrm>
+                      <a:off x="0" y="0"/>
+                      <a:ext cx="4686954" cy="857370"/>
+                    </a:xfrm>
+                    <a:prstGeom prst="rect">
+                      <a:avLst/>
+                    </a:prstGeom>
+                  </pic:spPr>
+                </pic:pic>
+              </a:graphicData>
+            </a:graphic>
+          </wp:inline>
+        </w:drawing>
+      </w:r>
+    </w:p>
+    <w:p>
+      <w:pPr>
+        <w:pStyle w:val="PargrafodaLista"/>
+        <w:jc w:val="center"/>
+      </w:pPr>
+    </w:p>
+    <w:p>
+      <w:pPr>
+        <w:pStyle w:val="PargrafodaLista"/>
+        <w:numPr>
+          <w:ilvl w:val="0"/>
+          <w:numId w:val="3"/>
+        </w:numPr>
+      </w:pPr>
+      <w:proofErr w:type="spellStart"/>
+      <w:r>
+        <w:t>C</w:t>
+      </w:r>
+      <w:r>
+        <w:t>ss</w:t>
+      </w:r>
+      <w:proofErr w:type="spellEnd"/>
+      <w:r>
+        <w:t>:</w:t>
+      </w:r>
+    </w:p>
+    <w:p>
+      <w:pPr>
+        <w:pStyle w:val="PargrafodaLista"/>
+      </w:pPr>
+    </w:p>
+    <w:p>
+      <w:pPr>
+        <w:pStyle w:val="PargrafodaLista"/>
+        <w:jc w:val="center"/>
+      </w:pPr>
+      <w:r>
+        <w:drawing>
+          <wp:inline distT="0" distB="0" distL="0" distR="0" wp14:anchorId="51CBDA23" wp14:editId="147C3FEB">
+            <wp:extent cx="3248478" cy="828791"/>
+            <wp:effectExtent l="0" t="0" r="0" b="9525"/>
+            <wp:docPr id="80" name="Imagem 80"/>
+            <wp:cNvGraphicFramePr>
+              <a:graphicFrameLocks xmlns:a="http://schemas.openxmlformats.org/drawingml/2006/main" noChangeAspect="1"/>
+            </wp:cNvGraphicFramePr>
+            <a:graphic xmlns:a="http://schemas.openxmlformats.org/drawingml/2006/main">
+              <a:graphicData uri="http://schemas.openxmlformats.org/drawingml/2006/picture">
+                <pic:pic xmlns:pic="http://schemas.openxmlformats.org/drawingml/2006/picture">
+                  <pic:nvPicPr>
+                    <pic:cNvPr id="1" name=""/>
+                    <pic:cNvPicPr/>
+                  </pic:nvPicPr>
+                  <pic:blipFill>
+                    <a:blip r:embed="rId90"/>
+                    <a:stretch>
+                      <a:fillRect/>
+                    </a:stretch>
+                  </pic:blipFill>
+                  <pic:spPr>
+                    <a:xfrm>
+                      <a:off x="0" y="0"/>
+                      <a:ext cx="3248478" cy="828791"/>
+                    </a:xfrm>
+                    <a:prstGeom prst="rect">
+                      <a:avLst/>
+                    </a:prstGeom>
+                  </pic:spPr>
+                </pic:pic>
+              </a:graphicData>
+            </a:graphic>
+          </wp:inline>
+        </w:drawing>
+      </w:r>
+    </w:p>
+    <w:p>
+      <w:pPr>
+        <w:pStyle w:val="PargrafodaLista"/>
+        <w:numPr>
+          <w:ilvl w:val="0"/>
+          <w:numId w:val="3"/>
+        </w:numPr>
+      </w:pPr>
+      <w:r>
+        <w:t>Site:</w:t>
+      </w:r>
+    </w:p>
+    <w:p>
+      <w:pPr>
+        <w:pStyle w:val="PargrafodaLista"/>
+      </w:pPr>
+    </w:p>
+    <w:p>
+      <w:pPr>
+        <w:pStyle w:val="PargrafodaLista"/>
+      </w:pPr>
+      <w:r>
+        <w:drawing>
+          <wp:inline distT="0" distB="0" distL="0" distR="0" wp14:anchorId="5BEA5CA9" wp14:editId="0316B716">
+            <wp:extent cx="5400040" cy="1005840"/>
+            <wp:effectExtent l="0" t="0" r="0" b="3810"/>
+            <wp:docPr id="83" name="Imagem 83"/>
+            <wp:cNvGraphicFramePr>
+              <a:graphicFrameLocks xmlns:a="http://schemas.openxmlformats.org/drawingml/2006/main" noChangeAspect="1"/>
+            </wp:cNvGraphicFramePr>
+            <a:graphic xmlns:a="http://schemas.openxmlformats.org/drawingml/2006/main">
+              <a:graphicData uri="http://schemas.openxmlformats.org/drawingml/2006/picture">
+                <pic:pic xmlns:pic="http://schemas.openxmlformats.org/drawingml/2006/picture">
+                  <pic:nvPicPr>
+                    <pic:cNvPr id="1" name=""/>
+                    <pic:cNvPicPr/>
+                  </pic:nvPicPr>
+                  <pic:blipFill>
+                    <a:blip r:embed="rId91"/>
+                    <a:stretch>
+                      <a:fillRect/>
+                    </a:stretch>
+                  </pic:blipFill>
+                  <pic:spPr>
+                    <a:xfrm>
+                      <a:off x="0" y="0"/>
+                      <a:ext cx="5400040" cy="1005840"/>
+                    </a:xfrm>
+                    <a:prstGeom prst="rect">
+                      <a:avLst/>
+                    </a:prstGeom>
+                  </pic:spPr>
+                </pic:pic>
+              </a:graphicData>
+            </a:graphic>
+          </wp:inline>
+        </w:drawing>
+      </w:r>
+    </w:p>
+    <w:p>
+      <w:pPr>
+        <w:pStyle w:val="PargrafodaLista"/>
+      </w:pPr>
+    </w:p>
+    <w:p>
+      <w:pPr>
+        <w:pStyle w:val="PargrafodaLista"/>
+        <w:numPr>
+          <w:ilvl w:val="0"/>
+          <w:numId w:val="4"/>
+        </w:numPr>
+      </w:pPr>
+      <w:r>
+        <w:t>Adição de imagem de fundo:</w:t>
+      </w:r>
+    </w:p>
+    <w:p>
+      <w:pPr>
+        <w:pStyle w:val="PargrafodaLista"/>
+      </w:pPr>
+    </w:p>
+    <w:p>
+      <w:pPr>
+        <w:pStyle w:val="PargrafodaLista"/>
+        <w:jc w:val="center"/>
+      </w:pPr>
+      <w:r>
+        <w:drawing>
+          <wp:inline distT="0" distB="0" distL="0" distR="0" wp14:anchorId="701B2A70" wp14:editId="5D37F2E9">
+            <wp:extent cx="3362794" cy="847843"/>
+            <wp:effectExtent l="0" t="0" r="9525" b="9525"/>
+            <wp:docPr id="81" name="Imagem 81"/>
+            <wp:cNvGraphicFramePr>
+              <a:graphicFrameLocks xmlns:a="http://schemas.openxmlformats.org/drawingml/2006/main" noChangeAspect="1"/>
+            </wp:cNvGraphicFramePr>
+            <a:graphic xmlns:a="http://schemas.openxmlformats.org/drawingml/2006/main">
+              <a:graphicData uri="http://schemas.openxmlformats.org/drawingml/2006/picture">
+                <pic:pic xmlns:pic="http://schemas.openxmlformats.org/drawingml/2006/picture">
+                  <pic:nvPicPr>
+                    <pic:cNvPr id="1" name=""/>
+                    <pic:cNvPicPr/>
+                  </pic:nvPicPr>
+                  <pic:blipFill>
+                    <a:blip r:embed="rId92"/>
+                    <a:stretch>
+                      <a:fillRect/>
+                    </a:stretch>
+                  </pic:blipFill>
+                  <pic:spPr>
+                    <a:xfrm>
+                      <a:off x="0" y="0"/>
+                      <a:ext cx="3362794" cy="847843"/>
+                    </a:xfrm>
+                    <a:prstGeom prst="rect">
+                      <a:avLst/>
+                    </a:prstGeom>
+                  </pic:spPr>
+                </pic:pic>
+              </a:graphicData>
+            </a:graphic>
+          </wp:inline>
+        </w:drawing>
+      </w:r>
+    </w:p>
+    <w:p>
+      <w:pPr>
+        <w:pStyle w:val="PargrafodaLista"/>
+      </w:pPr>
+    </w:p>
+    <w:p>
+      <w:pPr>
+        <w:pStyle w:val="PargrafodaLista"/>
+        <w:numPr>
+          <w:ilvl w:val="0"/>
+          <w:numId w:val="3"/>
+        </w:numPr>
+      </w:pPr>
+      <w:r>
+        <w:lastRenderedPageBreak/>
+        <w:t>Obs.: a cor de fundo não se faz mais necessário.</w:t>
+      </w:r>
+    </w:p>
+    <w:p>
+      <w:pPr>
+        <w:pStyle w:val="PargrafodaLista"/>
+      </w:pPr>
+    </w:p>
+    <w:p>
+      <w:pPr>
+        <w:pStyle w:val="PargrafodaLista"/>
+        <w:numPr>
+          <w:ilvl w:val="0"/>
+          <w:numId w:val="3"/>
+        </w:numPr>
+      </w:pPr>
+      <w:r>
+        <w:t>Site:</w:t>
+      </w:r>
+    </w:p>
+    <w:p>
+      <w:pPr>
+        <w:pStyle w:val="PargrafodaLista"/>
+      </w:pPr>
+    </w:p>
+    <w:p>
+      <w:pPr>
+        <w:pStyle w:val="PargrafodaLista"/>
+        <w:jc w:val="center"/>
+      </w:pPr>
+      <w:r>
+        <w:drawing>
+          <wp:inline distT="0" distB="0" distL="0" distR="0" wp14:anchorId="7399927F" wp14:editId="6D04A1EF">
+            <wp:extent cx="5400040" cy="980440"/>
+            <wp:effectExtent l="0" t="0" r="0" b="0"/>
+            <wp:docPr id="82" name="Imagem 82"/>
+            <wp:cNvGraphicFramePr>
+              <a:graphicFrameLocks xmlns:a="http://schemas.openxmlformats.org/drawingml/2006/main" noChangeAspect="1"/>
+            </wp:cNvGraphicFramePr>
+            <a:graphic xmlns:a="http://schemas.openxmlformats.org/drawingml/2006/main">
+              <a:graphicData uri="http://schemas.openxmlformats.org/drawingml/2006/picture">
+                <pic:pic xmlns:pic="http://schemas.openxmlformats.org/drawingml/2006/picture">
+                  <pic:nvPicPr>
+                    <pic:cNvPr id="1" name=""/>
+                    <pic:cNvPicPr/>
+                  </pic:nvPicPr>
+                  <pic:blipFill>
+                    <a:blip r:embed="rId93"/>
+                    <a:stretch>
+                      <a:fillRect/>
+                    </a:stretch>
+                  </pic:blipFill>
+                  <pic:spPr>
+                    <a:xfrm>
+                      <a:off x="0" y="0"/>
+                      <a:ext cx="5400040" cy="980440"/>
+                    </a:xfrm>
+                    <a:prstGeom prst="rect">
+                      <a:avLst/>
+                    </a:prstGeom>
+                  </pic:spPr>
+                </pic:pic>
+              </a:graphicData>
+            </a:graphic>
+          </wp:inline>
+        </w:drawing>
+      </w:r>
+    </w:p>
+    <w:p>
+      <w:pPr>
+        <w:pStyle w:val="PargrafodaLista"/>
+      </w:pPr>
+    </w:p>
+    <w:p>
+      <w:pPr>
+        <w:pStyle w:val="PargrafodaLista"/>
+        <w:numPr>
+          <w:ilvl w:val="0"/>
+          <w:numId w:val="3"/>
+        </w:numPr>
+      </w:pPr>
+      <w:r>
+        <w:t>Obs.: a natureza dela é se repetir até completar a página, para isso não ocorrer o código “background-</w:t>
+      </w:r>
+      <w:proofErr w:type="spellStart"/>
+      <w:r>
+        <w:t>repeat</w:t>
+      </w:r>
+      <w:proofErr w:type="spellEnd"/>
+      <w:r>
+        <w:t>: no-</w:t>
+      </w:r>
+      <w:proofErr w:type="spellStart"/>
+      <w:r>
+        <w:t>repeat</w:t>
+      </w:r>
+      <w:proofErr w:type="spellEnd"/>
+      <w:r>
+        <w:t xml:space="preserve">;” deverá ser adicionado ao </w:t>
+      </w:r>
+      <w:proofErr w:type="spellStart"/>
+      <w:r>
+        <w:t>css</w:t>
+      </w:r>
+      <w:proofErr w:type="spellEnd"/>
+      <w:r>
+        <w:t>:</w:t>
+      </w:r>
+    </w:p>
+    <w:p>
+      <w:pPr>
+        <w:pStyle w:val="PargrafodaLista"/>
+      </w:pPr>
+    </w:p>
+    <w:p>
+      <w:pPr>
+        <w:pStyle w:val="PargrafodaLista"/>
+        <w:jc w:val="center"/>
+      </w:pPr>
+      <w:r>
+        <w:drawing>
+          <wp:inline distT="0" distB="0" distL="0" distR="0" wp14:anchorId="6F713AE2" wp14:editId="65ECF283">
+            <wp:extent cx="3410426" cy="933580"/>
+            <wp:effectExtent l="0" t="0" r="0" b="0"/>
+            <wp:docPr id="84" name="Imagem 84"/>
+            <wp:cNvGraphicFramePr>
+              <a:graphicFrameLocks xmlns:a="http://schemas.openxmlformats.org/drawingml/2006/main" noChangeAspect="1"/>
+            </wp:cNvGraphicFramePr>
+            <a:graphic xmlns:a="http://schemas.openxmlformats.org/drawingml/2006/main">
+              <a:graphicData uri="http://schemas.openxmlformats.org/drawingml/2006/picture">
+                <pic:pic xmlns:pic="http://schemas.openxmlformats.org/drawingml/2006/picture">
+                  <pic:nvPicPr>
+                    <pic:cNvPr id="1" name=""/>
+                    <pic:cNvPicPr/>
+                  </pic:nvPicPr>
+                  <pic:blipFill>
+                    <a:blip r:embed="rId94"/>
+                    <a:stretch>
+                      <a:fillRect/>
+                    </a:stretch>
+                  </pic:blipFill>
+                  <pic:spPr>
+                    <a:xfrm>
+                      <a:off x="0" y="0"/>
+                      <a:ext cx="3410426" cy="933580"/>
+                    </a:xfrm>
+                    <a:prstGeom prst="rect">
+                      <a:avLst/>
+                    </a:prstGeom>
+                  </pic:spPr>
+                </pic:pic>
+              </a:graphicData>
+            </a:graphic>
+          </wp:inline>
+        </w:drawing>
+      </w:r>
+    </w:p>
+    <w:p>
+      <w:pPr>
+        <w:pStyle w:val="PargrafodaLista"/>
+        <w:jc w:val="center"/>
+      </w:pPr>
+    </w:p>
+    <w:p>
+      <w:pPr>
+        <w:pStyle w:val="PargrafodaLista"/>
+        <w:numPr>
+          <w:ilvl w:val="0"/>
+          <w:numId w:val="3"/>
+        </w:numPr>
+      </w:pPr>
+      <w:r>
+        <w:t>Site:</w:t>
+      </w:r>
+    </w:p>
+    <w:p>
+      <w:pPr>
+        <w:pStyle w:val="PargrafodaLista"/>
+      </w:pPr>
+    </w:p>
+    <w:p>
+      <w:pPr>
+        <w:pStyle w:val="PargrafodaLista"/>
+      </w:pPr>
+    </w:p>
+    <w:p>
+      <w:pPr>
+        <w:pStyle w:val="PargrafodaLista"/>
+      </w:pPr>
+      <w:r>
+        <w:drawing>
+          <wp:inline distT="0" distB="0" distL="0" distR="0" wp14:anchorId="7A7D52E9" wp14:editId="22640533">
+            <wp:extent cx="5400040" cy="1006475"/>
+            <wp:effectExtent l="0" t="0" r="0" b="3175"/>
+            <wp:docPr id="85" name="Imagem 85"/>
+            <wp:cNvGraphicFramePr>
+              <a:graphicFrameLocks xmlns:a="http://schemas.openxmlformats.org/drawingml/2006/main" noChangeAspect="1"/>
+            </wp:cNvGraphicFramePr>
+            <a:graphic xmlns:a="http://schemas.openxmlformats.org/drawingml/2006/main">
+              <a:graphicData uri="http://schemas.openxmlformats.org/drawingml/2006/picture">
+                <pic:pic xmlns:pic="http://schemas.openxmlformats.org/drawingml/2006/picture">
+                  <pic:nvPicPr>
+                    <pic:cNvPr id="1" name=""/>
+                    <pic:cNvPicPr/>
+                  </pic:nvPicPr>
+                  <pic:blipFill>
+                    <a:blip r:embed="rId95"/>
+                    <a:stretch>
+                      <a:fillRect/>
+                    </a:stretch>
+                  </pic:blipFill>
+                  <pic:spPr>
+                    <a:xfrm>
+                      <a:off x="0" y="0"/>
+                      <a:ext cx="5400040" cy="1006475"/>
+                    </a:xfrm>
+                    <a:prstGeom prst="rect">
+                      <a:avLst/>
+                    </a:prstGeom>
+                  </pic:spPr>
+                </pic:pic>
+              </a:graphicData>
+            </a:graphic>
+          </wp:inline>
+        </w:drawing>
+      </w:r>
+    </w:p>
+    <w:p>
+      <w:pPr>
+        <w:pStyle w:val="PargrafodaLista"/>
+      </w:pPr>
+    </w:p>
+    <w:p>
+      <w:pPr>
+        <w:pStyle w:val="PargrafodaLista"/>
+        <w:numPr>
+          <w:ilvl w:val="0"/>
+          <w:numId w:val="4"/>
+        </w:numPr>
+      </w:pPr>
+      <w:r>
+        <w:t>Adição de</w:t>
+      </w:r>
+      <w:r>
+        <w:t xml:space="preserve"> de</w:t>
+      </w:r>
+      <w:r>
+        <w:t>talhes</w:t>
+      </w:r>
+      <w:r>
+        <w:t>:</w:t>
+      </w:r>
+    </w:p>
+    <w:p>
+      <w:pPr>
+        <w:pStyle w:val="PargrafodaLista"/>
+      </w:pPr>
+    </w:p>
+    <w:p>
+      <w:pPr>
+        <w:pStyle w:val="PargrafodaLista"/>
+        <w:jc w:val="center"/>
+      </w:pPr>
+      <w:r>
+        <w:drawing>
+          <wp:inline distT="0" distB="0" distL="0" distR="0" wp14:anchorId="4B72BAD9" wp14:editId="0B76E237">
+            <wp:extent cx="3324689" cy="1381318"/>
+            <wp:effectExtent l="0" t="0" r="0" b="9525"/>
+            <wp:docPr id="86" name="Imagem 86"/>
+            <wp:cNvGraphicFramePr>
+              <a:graphicFrameLocks xmlns:a="http://schemas.openxmlformats.org/drawingml/2006/main" noChangeAspect="1"/>
+            </wp:cNvGraphicFramePr>
+            <a:graphic xmlns:a="http://schemas.openxmlformats.org/drawingml/2006/main">
+              <a:graphicData uri="http://schemas.openxmlformats.org/drawingml/2006/picture">
+                <pic:pic xmlns:pic="http://schemas.openxmlformats.org/drawingml/2006/picture">
+                  <pic:nvPicPr>
+                    <pic:cNvPr id="1" name=""/>
+                    <pic:cNvPicPr/>
+                  </pic:nvPicPr>
+                  <pic:blipFill>
+                    <a:blip r:embed="rId96"/>
+                    <a:stretch>
+                      <a:fillRect/>
+                    </a:stretch>
+                  </pic:blipFill>
+                  <pic:spPr>
+                    <a:xfrm>
+                      <a:off x="0" y="0"/>
+                      <a:ext cx="3324689" cy="1381318"/>
+                    </a:xfrm>
+                    <a:prstGeom prst="rect">
+                      <a:avLst/>
+                    </a:prstGeom>
+                  </pic:spPr>
+                </pic:pic>
+              </a:graphicData>
+            </a:graphic>
+          </wp:inline>
+        </w:drawing>
+      </w:r>
+    </w:p>
+    <w:p>
+      <w:pPr>
+        <w:pStyle w:val="PargrafodaLista"/>
+      </w:pPr>
+    </w:p>
+    <w:p>
+      <w:pPr>
+        <w:pStyle w:val="PargrafodaLista"/>
+        <w:numPr>
+          <w:ilvl w:val="0"/>
+          <w:numId w:val="3"/>
+        </w:numPr>
+      </w:pPr>
+      <w:r>
+        <w:t xml:space="preserve">Obs.: color (cor da letra) e </w:t>
+      </w:r>
+      <w:proofErr w:type="spellStart"/>
+      <w:r>
+        <w:t>font-size</w:t>
+      </w:r>
+      <w:proofErr w:type="spellEnd"/>
+      <w:r>
+        <w:t xml:space="preserve"> (tamanho da letra) para o parágrafo, e </w:t>
+      </w:r>
+      <w:proofErr w:type="spellStart"/>
+      <w:r>
+        <w:t>padding</w:t>
+      </w:r>
+      <w:proofErr w:type="spellEnd"/>
+      <w:r>
+        <w:t xml:space="preserve"> para espaçamento interno.</w:t>
+      </w:r>
+    </w:p>
+    <w:p>
+      <w:pPr>
+        <w:pStyle w:val="PargrafodaLista"/>
+      </w:pPr>
+    </w:p>
+    <w:p>
+      <w:pPr>
+        <w:pStyle w:val="PargrafodaLista"/>
+        <w:numPr>
+          <w:ilvl w:val="0"/>
+          <w:numId w:val="3"/>
+        </w:numPr>
+      </w:pPr>
+      <w:r>
+        <w:t>Site:</w:t>
+      </w:r>
+    </w:p>
+    <w:p>
+      <w:pPr>
+        <w:pStyle w:val="PargrafodaLista"/>
+      </w:pPr>
+    </w:p>
+    <w:p>
+      <w:pPr>
+        <w:pStyle w:val="PargrafodaLista"/>
+      </w:pPr>
+      <w:r>
+        <w:lastRenderedPageBreak/>
+        <w:drawing>
+          <wp:inline distT="0" distB="0" distL="0" distR="0" wp14:anchorId="374C6A04" wp14:editId="7E7F44F5">
+            <wp:extent cx="5400040" cy="1257935"/>
+            <wp:effectExtent l="0" t="0" r="0" b="0"/>
+            <wp:docPr id="87" name="Imagem 87"/>
+            <wp:cNvGraphicFramePr>
+              <a:graphicFrameLocks xmlns:a="http://schemas.openxmlformats.org/drawingml/2006/main" noChangeAspect="1"/>
+            </wp:cNvGraphicFramePr>
+            <a:graphic xmlns:a="http://schemas.openxmlformats.org/drawingml/2006/main">
+              <a:graphicData uri="http://schemas.openxmlformats.org/drawingml/2006/picture">
+                <pic:pic xmlns:pic="http://schemas.openxmlformats.org/drawingml/2006/picture">
+                  <pic:nvPicPr>
+                    <pic:cNvPr id="1" name=""/>
+                    <pic:cNvPicPr/>
+                  </pic:nvPicPr>
+                  <pic:blipFill>
+                    <a:blip r:embed="rId97"/>
+                    <a:stretch>
+                      <a:fillRect/>
+                    </a:stretch>
+                  </pic:blipFill>
+                  <pic:spPr>
+                    <a:xfrm>
+                      <a:off x="0" y="0"/>
+                      <a:ext cx="5400040" cy="1257935"/>
+                    </a:xfrm>
+                    <a:prstGeom prst="rect">
+                      <a:avLst/>
+                    </a:prstGeom>
+                  </pic:spPr>
+                </pic:pic>
+              </a:graphicData>
+            </a:graphic>
+          </wp:inline>
+        </w:drawing>
+      </w:r>
+    </w:p>
+    <w:p>
+      <w:pPr>
+        <w:pStyle w:val="PargrafodaLista"/>
+      </w:pPr>
+    </w:p>
+    <w:p>
+      <w:pPr>
+        <w:pStyle w:val="PargrafodaLista"/>
+        <w:numPr>
+          <w:ilvl w:val="0"/>
+          <w:numId w:val="4"/>
+        </w:numPr>
+      </w:pPr>
+      <w:r>
+        <w:t xml:space="preserve">Criação das páginas contatos.html e contatos.css, copiando o header e o </w:t>
+      </w:r>
+      <w:proofErr w:type="spellStart"/>
+      <w:r>
+        <w:t>footer</w:t>
+      </w:r>
+      <w:proofErr w:type="spellEnd"/>
+      <w:r>
+        <w:t xml:space="preserve"> da página produtos.html repetindo o mesmo processo na página produtos.css em seus respectivos lugares em contatos.</w:t>
+      </w:r>
+    </w:p>
+    <w:p>
+      <w:pPr>
+        <w:pStyle w:val="PargrafodaLista"/>
+      </w:pPr>
+    </w:p>
+    <w:p>
+      <w:pPr>
+        <w:pStyle w:val="PargrafodaLista"/>
+        <w:numPr>
+          <w:ilvl w:val="0"/>
+          <w:numId w:val="3"/>
+        </w:numPr>
+      </w:pPr>
+      <w:proofErr w:type="spellStart"/>
+      <w:r>
+        <w:t>Html</w:t>
+      </w:r>
+      <w:proofErr w:type="spellEnd"/>
+      <w:r>
+        <w:t xml:space="preserve"> header:</w:t>
+      </w:r>
+    </w:p>
+    <w:p>
+      <w:pPr>
+        <w:pStyle w:val="PargrafodaLista"/>
+      </w:pPr>
+    </w:p>
+    <w:p>
+      <w:pPr>
+        <w:pStyle w:val="PargrafodaLista"/>
+        <w:jc w:val="center"/>
+      </w:pPr>
+      <w:r>
+        <w:drawing>
+          <wp:inline distT="0" distB="0" distL="0" distR="0" wp14:anchorId="38192364" wp14:editId="38DC4644">
+            <wp:extent cx="3835729" cy="3027680"/>
+            <wp:effectExtent l="0" t="0" r="0" b="1270"/>
+            <wp:docPr id="90" name="Imagem 90"/>
+            <wp:cNvGraphicFramePr>
+              <a:graphicFrameLocks xmlns:a="http://schemas.openxmlformats.org/drawingml/2006/main" noChangeAspect="1"/>
+            </wp:cNvGraphicFramePr>
+            <a:graphic xmlns:a="http://schemas.openxmlformats.org/drawingml/2006/main">
+              <a:graphicData uri="http://schemas.openxmlformats.org/drawingml/2006/picture">
+                <pic:pic xmlns:pic="http://schemas.openxmlformats.org/drawingml/2006/picture">
+                  <pic:nvPicPr>
+                    <pic:cNvPr id="1" name=""/>
+                    <pic:cNvPicPr/>
+                  </pic:nvPicPr>
+                  <pic:blipFill>
+                    <a:blip r:embed="rId98"/>
+                    <a:stretch>
+                      <a:fillRect/>
+                    </a:stretch>
+                  </pic:blipFill>
+                  <pic:spPr>
+                    <a:xfrm>
+                      <a:off x="0" y="0"/>
+                      <a:ext cx="3851240" cy="3039924"/>
+                    </a:xfrm>
+                    <a:prstGeom prst="rect">
+                      <a:avLst/>
+                    </a:prstGeom>
+                  </pic:spPr>
+                </pic:pic>
+              </a:graphicData>
+            </a:graphic>
+          </wp:inline>
+        </w:drawing>
+      </w:r>
+    </w:p>
+    <w:p>
+      <w:pPr>
+        <w:pStyle w:val="PargrafodaLista"/>
+      </w:pPr>
+    </w:p>
+    <w:p>
+      <w:pPr>
+        <w:pStyle w:val="PargrafodaLista"/>
+        <w:numPr>
+          <w:ilvl w:val="0"/>
+          <w:numId w:val="3"/>
+        </w:numPr>
+      </w:pPr>
+      <w:proofErr w:type="spellStart"/>
+      <w:r>
+        <w:t>Css</w:t>
+      </w:r>
+      <w:proofErr w:type="spellEnd"/>
+      <w:r>
+        <w:t xml:space="preserve"> header:</w:t>
+      </w:r>
+    </w:p>
+    <w:p>
+      <w:pPr>
+        <w:pStyle w:val="PargrafodaLista"/>
+      </w:pPr>
+    </w:p>
+    <w:p>
+      <w:pPr>
+        <w:pStyle w:val="PargrafodaLista"/>
+        <w:jc w:val="center"/>
+      </w:pPr>
+      <w:r>
+        <w:lastRenderedPageBreak/>
+        <w:drawing>
+          <wp:inline distT="0" distB="0" distL="0" distR="0" wp14:anchorId="33391251" wp14:editId="2F807FD9">
+            <wp:extent cx="2010056" cy="4286848"/>
+            <wp:effectExtent l="0" t="0" r="9525" b="0"/>
+            <wp:docPr id="91" name="Imagem 91"/>
+            <wp:cNvGraphicFramePr>
+              <a:graphicFrameLocks xmlns:a="http://schemas.openxmlformats.org/drawingml/2006/main" noChangeAspect="1"/>
+            </wp:cNvGraphicFramePr>
+            <a:graphic xmlns:a="http://schemas.openxmlformats.org/drawingml/2006/main">
+              <a:graphicData uri="http://schemas.openxmlformats.org/drawingml/2006/picture">
+                <pic:pic xmlns:pic="http://schemas.openxmlformats.org/drawingml/2006/picture">
+                  <pic:nvPicPr>
+                    <pic:cNvPr id="1" name=""/>
+                    <pic:cNvPicPr/>
+                  </pic:nvPicPr>
+                  <pic:blipFill>
+                    <a:blip r:embed="rId99"/>
+                    <a:stretch>
+                      <a:fillRect/>
+                    </a:stretch>
+                  </pic:blipFill>
+                  <pic:spPr>
+                    <a:xfrm>
+                      <a:off x="0" y="0"/>
+                      <a:ext cx="2010056" cy="4286848"/>
+                    </a:xfrm>
+                    <a:prstGeom prst="rect">
+                      <a:avLst/>
+                    </a:prstGeom>
+                  </pic:spPr>
+                </pic:pic>
+              </a:graphicData>
+            </a:graphic>
+          </wp:inline>
+        </w:drawing>
       </w:r>
       <w:bookmarkStart w:id="0" w:name="_GoBack"/>
       <w:bookmarkEnd w:id="0"/>
+    </w:p>
+    <w:p>
+      <w:pPr>
+        <w:pStyle w:val="PargrafodaLista"/>
+      </w:pPr>
+    </w:p>
+    <w:p>
+      <w:pPr>
+        <w:pStyle w:val="PargrafodaLista"/>
+        <w:numPr>
+          <w:ilvl w:val="0"/>
+          <w:numId w:val="3"/>
+        </w:numPr>
+      </w:pPr>
+      <w:proofErr w:type="spellStart"/>
+      <w:r>
+        <w:t>Html</w:t>
+      </w:r>
+      <w:proofErr w:type="spellEnd"/>
+      <w:r>
+        <w:t xml:space="preserve"> </w:t>
+      </w:r>
+      <w:proofErr w:type="spellStart"/>
+      <w:r>
+        <w:t>footer</w:t>
+      </w:r>
+      <w:proofErr w:type="spellEnd"/>
+      <w:r>
+        <w:t>:</w:t>
+      </w:r>
+    </w:p>
+    <w:p>
+      <w:pPr>
+        <w:pStyle w:val="PargrafodaLista"/>
+      </w:pPr>
+    </w:p>
+    <w:p>
+      <w:pPr>
+        <w:pStyle w:val="PargrafodaLista"/>
+        <w:jc w:val="center"/>
+      </w:pPr>
+      <w:r>
+        <w:drawing>
+          <wp:inline distT="0" distB="0" distL="0" distR="0" wp14:anchorId="1E4DF40B" wp14:editId="2F97FAA0">
+            <wp:extent cx="4725059" cy="1743318"/>
+            <wp:effectExtent l="0" t="0" r="0" b="9525"/>
+            <wp:docPr id="89" name="Imagem 89"/>
+            <wp:cNvGraphicFramePr>
+              <a:graphicFrameLocks xmlns:a="http://schemas.openxmlformats.org/drawingml/2006/main" noChangeAspect="1"/>
+            </wp:cNvGraphicFramePr>
+            <a:graphic xmlns:a="http://schemas.openxmlformats.org/drawingml/2006/main">
+              <a:graphicData uri="http://schemas.openxmlformats.org/drawingml/2006/picture">
+                <pic:pic xmlns:pic="http://schemas.openxmlformats.org/drawingml/2006/picture">
+                  <pic:nvPicPr>
+                    <pic:cNvPr id="1" name=""/>
+                    <pic:cNvPicPr/>
+                  </pic:nvPicPr>
+                  <pic:blipFill>
+                    <a:blip r:embed="rId100"/>
+                    <a:stretch>
+                      <a:fillRect/>
+                    </a:stretch>
+                  </pic:blipFill>
+                  <pic:spPr>
+                    <a:xfrm>
+                      <a:off x="0" y="0"/>
+                      <a:ext cx="4725059" cy="1743318"/>
+                    </a:xfrm>
+                    <a:prstGeom prst="rect">
+                      <a:avLst/>
+                    </a:prstGeom>
+                  </pic:spPr>
+                </pic:pic>
+              </a:graphicData>
+            </a:graphic>
+          </wp:inline>
+        </w:drawing>
+      </w:r>
+    </w:p>
+    <w:p>
+      <w:pPr>
+        <w:pStyle w:val="PargrafodaLista"/>
+      </w:pPr>
+    </w:p>
+    <w:p>
+      <w:pPr>
+        <w:pStyle w:val="PargrafodaLista"/>
+        <w:numPr>
+          <w:ilvl w:val="0"/>
+          <w:numId w:val="3"/>
+        </w:numPr>
+      </w:pPr>
+      <w:proofErr w:type="spellStart"/>
+      <w:r>
+        <w:t>Css</w:t>
+      </w:r>
+      <w:proofErr w:type="spellEnd"/>
+      <w:r>
+        <w:t xml:space="preserve"> </w:t>
+      </w:r>
+      <w:proofErr w:type="spellStart"/>
+      <w:r>
+        <w:t>footer</w:t>
+      </w:r>
+      <w:proofErr w:type="spellEnd"/>
+      <w:r>
+        <w:t>:</w:t>
+      </w:r>
+    </w:p>
+    <w:p>
+      <w:pPr>
+        <w:pStyle w:val="PargrafodaLista"/>
+      </w:pPr>
+    </w:p>
+    <w:p>
+      <w:pPr>
+        <w:pStyle w:val="PargrafodaLista"/>
+        <w:jc w:val="center"/>
+      </w:pPr>
+      <w:r>
+        <w:drawing>
+          <wp:inline distT="0" distB="0" distL="0" distR="0" wp14:anchorId="0DF12486" wp14:editId="7712E6CB">
+            <wp:extent cx="3219899" cy="1267002"/>
+            <wp:effectExtent l="0" t="0" r="0" b="9525"/>
+            <wp:docPr id="88" name="Imagem 88"/>
+            <wp:cNvGraphicFramePr>
+              <a:graphicFrameLocks xmlns:a="http://schemas.openxmlformats.org/drawingml/2006/main" noChangeAspect="1"/>
+            </wp:cNvGraphicFramePr>
+            <a:graphic xmlns:a="http://schemas.openxmlformats.org/drawingml/2006/main">
+              <a:graphicData uri="http://schemas.openxmlformats.org/drawingml/2006/picture">
+                <pic:pic xmlns:pic="http://schemas.openxmlformats.org/drawingml/2006/picture">
+                  <pic:nvPicPr>
+                    <pic:cNvPr id="1" name=""/>
+                    <pic:cNvPicPr/>
+                  </pic:nvPicPr>
+                  <pic:blipFill>
+                    <a:blip r:embed="rId101"/>
+                    <a:stretch>
+                      <a:fillRect/>
+                    </a:stretch>
+                  </pic:blipFill>
+                  <pic:spPr>
+                    <a:xfrm>
+                      <a:off x="0" y="0"/>
+                      <a:ext cx="3219899" cy="1267002"/>
+                    </a:xfrm>
+                    <a:prstGeom prst="rect">
+                      <a:avLst/>
+                    </a:prstGeom>
+                  </pic:spPr>
+                </pic:pic>
+              </a:graphicData>
+            </a:graphic>
+          </wp:inline>
+        </w:drawing>
+      </w:r>
     </w:p>
     <w:sectPr>
       <w:pgSz w:w="11906" w:h="16838"/>
@@ -7165,21 +8504,6 @@
 </file>
 
 <file path=customXml/item1.xml><?xml version="1.0" encoding="utf-8"?>
-<?mso-contentType ?>
-<FormTemplates xmlns="http://schemas.microsoft.com/sharepoint/v3/contenttype/forms">
-  <Display>DocumentLibraryForm</Display>
-  <Edit>DocumentLibraryForm</Edit>
-  <New>DocumentLibraryForm</New>
-</FormTemplates>
-</file>
-
-<file path=customXml/item2.xml><?xml version="1.0" encoding="utf-8"?>
-<p:properties xmlns:p="http://schemas.microsoft.com/office/2006/metadata/properties" xmlns:xsi="http://www.w3.org/2001/XMLSchema-instance" xmlns:pc="http://schemas.microsoft.com/office/infopath/2007/PartnerControls">
-  <documentManagement/>
-</p:properties>
-</file>
-
-<file path=customXml/item3.xml><?xml version="1.0" encoding="utf-8"?>
 <ct:contentTypeSchema xmlns:ct="http://schemas.microsoft.com/office/2006/metadata/contentType" xmlns:ma="http://schemas.microsoft.com/office/2006/metadata/properties/metaAttributes" ct:_="" ma:_="" ma:contentTypeName="Documento" ma:contentTypeID="0x010100505A3988A18C25428D7BB10E521541B0" ma:contentTypeVersion="8" ma:contentTypeDescription="Crie um novo documento." ma:contentTypeScope="" ma:versionID="ae23e9bf37998961397b45837b69f3af">
   <xsd:schema xmlns:xsd="http://www.w3.org/2001/XMLSchema" xmlns:xs="http://www.w3.org/2001/XMLSchema" xmlns:p="http://schemas.microsoft.com/office/2006/metadata/properties" xmlns:ns3="e2b1f529-36c3-4fcb-8be1-4f3f8816101a" targetNamespace="http://schemas.microsoft.com/office/2006/metadata/properties" ma:root="true" ma:fieldsID="3d6548e1f895b3cb6150e76934ecd33a" ns3:_="">
     <xsd:import namespace="e2b1f529-36c3-4fcb-8be1-4f3f8816101a"/>
@@ -7349,35 +8673,26 @@
 </ct:contentTypeSchema>
 </file>
 
+<file path=customXml/item2.xml><?xml version="1.0" encoding="utf-8"?>
+<?mso-contentType ?>
+<FormTemplates xmlns="http://schemas.microsoft.com/sharepoint/v3/contenttype/forms">
+  <Display>DocumentLibraryForm</Display>
+  <Edit>DocumentLibraryForm</Edit>
+  <New>DocumentLibraryForm</New>
+</FormTemplates>
+</file>
+
+<file path=customXml/item3.xml><?xml version="1.0" encoding="utf-8"?>
+<p:properties xmlns:p="http://schemas.microsoft.com/office/2006/metadata/properties" xmlns:xsi="http://www.w3.org/2001/XMLSchema-instance" xmlns:pc="http://schemas.microsoft.com/office/infopath/2007/PartnerControls">
+  <documentManagement/>
+</p:properties>
+</file>
+
 <file path=customXml/item4.xml><?xml version="1.0" encoding="utf-8"?>
 <b:Sources xmlns:b="http://schemas.openxmlformats.org/officeDocument/2006/bibliography" xmlns="http://schemas.openxmlformats.org/officeDocument/2006/bibliography" SelectedStyle="\APASixthEditionOfficeOnline.xsl" StyleName="APA" Version="6"/>
 </file>
 
 <file path=customXml/itemProps1.xml><?xml version="1.0" encoding="utf-8"?>
-<ds:datastoreItem xmlns:ds="http://schemas.openxmlformats.org/officeDocument/2006/customXml" ds:itemID="{263E0CB6-E330-45F6-9AAC-68409DB40271}">
-  <ds:schemaRefs>
-    <ds:schemaRef ds:uri="http://schemas.microsoft.com/sharepoint/v3/contenttype/forms"/>
-  </ds:schemaRefs>
-</ds:datastoreItem>
-</file>
-
-<file path=customXml/itemProps2.xml><?xml version="1.0" encoding="utf-8"?>
-<ds:datastoreItem xmlns:ds="http://schemas.openxmlformats.org/officeDocument/2006/customXml" ds:itemID="{3124EC2B-CD6D-4EC1-9DEC-2AAFA53F32A6}">
-  <ds:schemaRefs>
-    <ds:schemaRef ds:uri="http://purl.org/dc/dcmitype/"/>
-    <ds:schemaRef ds:uri="http://schemas.microsoft.com/office/2006/documentManagement/types"/>
-    <ds:schemaRef ds:uri="http://purl.org/dc/terms/"/>
-    <ds:schemaRef ds:uri="http://purl.org/dc/elements/1.1/"/>
-    <ds:schemaRef ds:uri="http://www.w3.org/XML/1998/namespace"/>
-    <ds:schemaRef ds:uri="e2b1f529-36c3-4fcb-8be1-4f3f8816101a"/>
-    <ds:schemaRef ds:uri="http://schemas.microsoft.com/office/infopath/2007/PartnerControls"/>
-    <ds:schemaRef ds:uri="http://schemas.openxmlformats.org/package/2006/metadata/core-properties"/>
-    <ds:schemaRef ds:uri="http://schemas.microsoft.com/office/2006/metadata/properties"/>
-  </ds:schemaRefs>
-</ds:datastoreItem>
-</file>
-
-<file path=customXml/itemProps3.xml><?xml version="1.0" encoding="utf-8"?>
 <ds:datastoreItem xmlns:ds="http://schemas.openxmlformats.org/officeDocument/2006/customXml" ds:itemID="{4AC5D033-2B45-4E39-A66C-DCF8D41218A3}">
   <ds:schemaRefs>
     <ds:schemaRef ds:uri="http://schemas.microsoft.com/office/2006/metadata/contentType"/>
@@ -7395,8 +8710,32 @@
 </ds:datastoreItem>
 </file>
 
+<file path=customXml/itemProps2.xml><?xml version="1.0" encoding="utf-8"?>
+<ds:datastoreItem xmlns:ds="http://schemas.openxmlformats.org/officeDocument/2006/customXml" ds:itemID="{263E0CB6-E330-45F6-9AAC-68409DB40271}">
+  <ds:schemaRefs>
+    <ds:schemaRef ds:uri="http://schemas.microsoft.com/sharepoint/v3/contenttype/forms"/>
+  </ds:schemaRefs>
+</ds:datastoreItem>
+</file>
+
+<file path=customXml/itemProps3.xml><?xml version="1.0" encoding="utf-8"?>
+<ds:datastoreItem xmlns:ds="http://schemas.openxmlformats.org/officeDocument/2006/customXml" ds:itemID="{3124EC2B-CD6D-4EC1-9DEC-2AAFA53F32A6}">
+  <ds:schemaRefs>
+    <ds:schemaRef ds:uri="http://schemas.microsoft.com/office/2006/metadata/properties"/>
+    <ds:schemaRef ds:uri="e2b1f529-36c3-4fcb-8be1-4f3f8816101a"/>
+    <ds:schemaRef ds:uri="http://schemas.microsoft.com/office/2006/documentManagement/types"/>
+    <ds:schemaRef ds:uri="http://www.w3.org/XML/1998/namespace"/>
+    <ds:schemaRef ds:uri="http://purl.org/dc/terms/"/>
+    <ds:schemaRef ds:uri="http://purl.org/dc/dcmitype/"/>
+    <ds:schemaRef ds:uri="http://schemas.microsoft.com/office/infopath/2007/PartnerControls"/>
+    <ds:schemaRef ds:uri="http://schemas.openxmlformats.org/package/2006/metadata/core-properties"/>
+    <ds:schemaRef ds:uri="http://purl.org/dc/elements/1.1/"/>
+  </ds:schemaRefs>
+</ds:datastoreItem>
+</file>
+
 <file path=customXml/itemProps4.xml><?xml version="1.0" encoding="utf-8"?>
-<ds:datastoreItem xmlns:ds="http://schemas.openxmlformats.org/officeDocument/2006/customXml" ds:itemID="{961A28DD-B3E1-436D-83C6-8EE80E6BE5DA}">
+<ds:datastoreItem xmlns:ds="http://schemas.openxmlformats.org/officeDocument/2006/customXml" ds:itemID="{D13E51D9-B3F4-4A39-B87C-971E851FC693}">
   <ds:schemaRefs>
     <ds:schemaRef ds:uri="http://schemas.openxmlformats.org/officeDocument/2006/bibliography"/>
   </ds:schemaRefs>

</xml_diff>